<commit_message>
refresh: 2026-05-13 — 10 files
</commit_message>
<xml_diff>
--- a/reports/ELNY_competitive_analysis_v2.docx
+++ b/reports/ELNY_competitive_analysis_v2.docx
@@ -11190,16 +11190,44 @@
       <w:jc w:val="center"/>
     </w:pPr>
     <w:r>
-      <w:rPr>
-        <w:rFonts w:ascii="Montserrat" w:cs="Montserrat" w:eastAsia="Montserrat" w:hAnsi="Montserrat"/>
-        <w:b/>
-        <w:bCs/>
-        <w:color w:val="3C3C3B"/>
-        <w:spacing w:val="80"/>
-        <w:sz w:val="18"/>
-        <w:szCs w:val="18"/>
-      </w:rPr>
-      <w:t xml:space="preserve">E L N Y</w:t>
+      <w:drawing>
+        <wp:inline distT="0" distB="0" distL="0" distR="0">
+          <wp:extent cx="666750" cy="266700"/>
+          <wp:effectExtent t="0" r="0" b="0" l="0"/>
+          <wp:docPr id="1" name="elny-logo" descr="ELNY logo" title="ELNY"/>
+          <wp:cNvGraphicFramePr>
+            <a:graphicFrameLocks xmlns:a="http://schemas.openxmlformats.org/drawingml/2006/main" noChangeAspect="1"/>
+          </wp:cNvGraphicFramePr>
+          <a:graphic xmlns:a="http://schemas.openxmlformats.org/drawingml/2006/main">
+            <a:graphicData uri="http://schemas.openxmlformats.org/drawingml/2006/picture">
+              <pic:pic xmlns:pic="http://schemas.openxmlformats.org/drawingml/2006/picture">
+                <pic:nvPicPr>
+                  <pic:cNvPr id="0" name="" descr=""/>
+                  <pic:cNvPicPr>
+                    <a:picLocks noChangeAspect="1" noChangeArrowheads="1"/>
+                  </pic:cNvPicPr>
+                </pic:nvPicPr>
+                <pic:blipFill>
+                  <a:blip r:embed="rId0" cstate="none"/>
+                  <a:srcRect/>
+                  <a:stretch>
+                    <a:fillRect/>
+                  </a:stretch>
+                </pic:blipFill>
+                <pic:spPr bwMode="auto">
+                  <a:xfrm>
+                    <a:off x="0" y="0"/>
+                    <a:ext cx="666750" cy="266700"/>
+                  </a:xfrm>
+                  <a:prstGeom prst="rect">
+                    <a:avLst/>
+                  </a:prstGeom>
+                </pic:spPr>
+              </pic:pic>
+            </a:graphicData>
+          </a:graphic>
+        </wp:inline>
+      </w:drawing>
     </w:r>
   </w:p>
   <w:p>

</xml_diff>